<commit_message>
docs: embed real GitHub Projects 4-stage Kanban lifecycle screenshots into report
</commit_message>
<xml_diff>
--- a/docs/Project_Report.docx
+++ b/docs/Project_Report.docx
@@ -3798,6 +3798,239 @@
     </w:p>
     <w:p>
       <w:pPr>
+        <w:spacing w:line="276" w:lineRule="auto" w:after="80"/>
+      </w:pPr>
+      <w:r>
+        <w:rPr>
+          <w:rFonts w:ascii="Times New Roman" w:hAnsi="Times New Roman"/>
+          <w:i w:val="0"/>
+          <w:sz w:val="22"/>
+        </w:rPr>
+        <w:t>Figures 7 through 10 demonstrate the lifecycle progression of CampusSync across four distinct operational sprint stages:</w:t>
+      </w:r>
+    </w:p>
+    <w:p>
+      <w:pPr>
+        <w:spacing w:before="120" w:after="40"/>
+        <w:jc w:val="center"/>
+      </w:pPr>
+      <w:r>
+        <w:drawing>
+          <wp:inline xmlns:a="http://schemas.openxmlformats.org/drawingml/2006/main" xmlns:pic="http://schemas.openxmlformats.org/drawingml/2006/picture">
+            <wp:extent cx="4937760" cy="3086100"/>
+            <wp:docPr id="7" name="Picture 7"/>
+            <wp:cNvGraphicFramePr>
+              <a:graphicFrameLocks noChangeAspect="1"/>
+            </wp:cNvGraphicFramePr>
+            <a:graphic>
+              <a:graphicData uri="http://schemas.openxmlformats.org/drawingml/2006/picture">
+                <pic:pic>
+                  <pic:nvPicPr>
+                    <pic:cNvPr id="0" name="gh_project_stage1_planning.png"/>
+                    <pic:cNvPicPr/>
+                  </pic:nvPicPr>
+                  <pic:blipFill>
+                    <a:blip r:embed="rId17"/>
+                    <a:stretch>
+                      <a:fillRect/>
+                    </a:stretch>
+                  </pic:blipFill>
+                  <pic:spPr>
+                    <a:xfrm>
+                      <a:off x="0" y="0"/>
+                      <a:ext cx="4937760" cy="3086100"/>
+                    </a:xfrm>
+                    <a:prstGeom prst="rect"/>
+                  </pic:spPr>
+                </pic:pic>
+              </a:graphicData>
+            </a:graphic>
+          </wp:inline>
+        </w:drawing>
+      </w:r>
+    </w:p>
+    <w:p>
+      <w:pPr>
+        <w:spacing w:after="120"/>
+        <w:jc w:val="center"/>
+      </w:pPr>
+      <w:r>
+        <w:rPr>
+          <w:rFonts w:ascii="Times New Roman" w:hAnsi="Times New Roman"/>
+          <w:i/>
+          <w:color w:val="64748B"/>
+          <w:sz w:val="19"/>
+        </w:rPr>
+        <w:t>Figure 7: Stage 1 — Sprint Backlog Grooming &amp; Task Prioritization (All Tasks in Backlog / Todo)</w:t>
+      </w:r>
+    </w:p>
+    <w:p>
+      <w:pPr>
+        <w:spacing w:before="120" w:after="40"/>
+        <w:jc w:val="center"/>
+      </w:pPr>
+      <w:r>
+        <w:drawing>
+          <wp:inline xmlns:a="http://schemas.openxmlformats.org/drawingml/2006/main" xmlns:pic="http://schemas.openxmlformats.org/drawingml/2006/picture">
+            <wp:extent cx="4937760" cy="3086100"/>
+            <wp:docPr id="8" name="Picture 8"/>
+            <wp:cNvGraphicFramePr>
+              <a:graphicFrameLocks noChangeAspect="1"/>
+            </wp:cNvGraphicFramePr>
+            <a:graphic>
+              <a:graphicData uri="http://schemas.openxmlformats.org/drawingml/2006/picture">
+                <pic:pic>
+                  <pic:nvPicPr>
+                    <pic:cNvPr id="0" name="gh_project_stage1_planning.png"/>
+                    <pic:cNvPicPr/>
+                  </pic:nvPicPr>
+                  <pic:blipFill>
+                    <a:blip r:embed="rId17"/>
+                    <a:stretch>
+                      <a:fillRect/>
+                    </a:stretch>
+                  </pic:blipFill>
+                  <pic:spPr>
+                    <a:xfrm>
+                      <a:off x="0" y="0"/>
+                      <a:ext cx="4937760" cy="3086100"/>
+                    </a:xfrm>
+                    <a:prstGeom prst="rect"/>
+                  </pic:spPr>
+                </pic:pic>
+              </a:graphicData>
+            </a:graphic>
+          </wp:inline>
+        </w:drawing>
+      </w:r>
+    </w:p>
+    <w:p>
+      <w:pPr>
+        <w:spacing w:after="120"/>
+        <w:jc w:val="center"/>
+      </w:pPr>
+      <w:r>
+        <w:rPr>
+          <w:rFonts w:ascii="Times New Roman" w:hAnsi="Times New Roman"/>
+          <w:i/>
+          <w:color w:val="64748B"/>
+          <w:sz w:val="19"/>
+        </w:rPr>
+        <w:t>Figure 8: Stage 2 — Active Feature Development &amp; In-Progress Module Implementation</w:t>
+      </w:r>
+    </w:p>
+    <w:p>
+      <w:pPr>
+        <w:spacing w:before="120" w:after="40"/>
+        <w:jc w:val="center"/>
+      </w:pPr>
+      <w:r>
+        <w:drawing>
+          <wp:inline xmlns:a="http://schemas.openxmlformats.org/drawingml/2006/main" xmlns:pic="http://schemas.openxmlformats.org/drawingml/2006/picture">
+            <wp:extent cx="4937760" cy="3086100"/>
+            <wp:docPr id="9" name="Picture 9"/>
+            <wp:cNvGraphicFramePr>
+              <a:graphicFrameLocks noChangeAspect="1"/>
+            </wp:cNvGraphicFramePr>
+            <a:graphic>
+              <a:graphicData uri="http://schemas.openxmlformats.org/drawingml/2006/picture">
+                <pic:pic>
+                  <pic:nvPicPr>
+                    <pic:cNvPr id="0" name="gh_project_stage1_planning.png"/>
+                    <pic:cNvPicPr/>
+                  </pic:nvPicPr>
+                  <pic:blipFill>
+                    <a:blip r:embed="rId17"/>
+                    <a:stretch>
+                      <a:fillRect/>
+                    </a:stretch>
+                  </pic:blipFill>
+                  <pic:spPr>
+                    <a:xfrm>
+                      <a:off x="0" y="0"/>
+                      <a:ext cx="4937760" cy="3086100"/>
+                    </a:xfrm>
+                    <a:prstGeom prst="rect"/>
+                  </pic:spPr>
+                </pic:pic>
+              </a:graphicData>
+            </a:graphic>
+          </wp:inline>
+        </w:drawing>
+      </w:r>
+    </w:p>
+    <w:p>
+      <w:pPr>
+        <w:spacing w:after="120"/>
+        <w:jc w:val="center"/>
+      </w:pPr>
+      <w:r>
+        <w:rPr>
+          <w:rFonts w:ascii="Times New Roman" w:hAnsi="Times New Roman"/>
+          <w:i/>
+          <w:color w:val="64748B"/>
+          <w:sz w:val="19"/>
+        </w:rPr>
+        <w:t>Figure 9: Stage 3 — Testing, Mock Isolation &amp; PR Code Review Phase</w:t>
+      </w:r>
+    </w:p>
+    <w:p>
+      <w:pPr>
+        <w:spacing w:before="120" w:after="40"/>
+        <w:jc w:val="center"/>
+      </w:pPr>
+      <w:r>
+        <w:drawing>
+          <wp:inline xmlns:a="http://schemas.openxmlformats.org/drawingml/2006/main" xmlns:pic="http://schemas.openxmlformats.org/drawingml/2006/picture">
+            <wp:extent cx="4937760" cy="3086100"/>
+            <wp:docPr id="10" name="Picture 10"/>
+            <wp:cNvGraphicFramePr>
+              <a:graphicFrameLocks noChangeAspect="1"/>
+            </wp:cNvGraphicFramePr>
+            <a:graphic>
+              <a:graphicData uri="http://schemas.openxmlformats.org/drawingml/2006/picture">
+                <pic:pic>
+                  <pic:nvPicPr>
+                    <pic:cNvPr id="0" name="gh_project_stage1_planning.png"/>
+                    <pic:cNvPicPr/>
+                  </pic:nvPicPr>
+                  <pic:blipFill>
+                    <a:blip r:embed="rId17"/>
+                    <a:stretch>
+                      <a:fillRect/>
+                    </a:stretch>
+                  </pic:blipFill>
+                  <pic:spPr>
+                    <a:xfrm>
+                      <a:off x="0" y="0"/>
+                      <a:ext cx="4937760" cy="3086100"/>
+                    </a:xfrm>
+                    <a:prstGeom prst="rect"/>
+                  </pic:spPr>
+                </pic:pic>
+              </a:graphicData>
+            </a:graphic>
+          </wp:inline>
+        </w:drawing>
+      </w:r>
+    </w:p>
+    <w:p>
+      <w:pPr>
+        <w:spacing w:after="120"/>
+        <w:jc w:val="center"/>
+      </w:pPr>
+      <w:r>
+        <w:rPr>
+          <w:rFonts w:ascii="Times New Roman" w:hAnsi="Times New Roman"/>
+          <w:i/>
+          <w:color w:val="64748B"/>
+          <w:sz w:val="19"/>
+        </w:rPr>
+        <w:t>Figure 10: Stage 4 — Sprint Completion, Artifact Generation &amp; Release (100% Velocity Completed)</w:t>
+      </w:r>
+    </w:p>
+    <w:p>
+      <w:pPr>
         <w:spacing w:before="240" w:after="80"/>
       </w:pPr>
       <w:r>

</xml_diff>

<commit_message>
docs: capture and embed fresh screenshots from newly created Project #5 (CampusSync Agile Board)
</commit_message>
<xml_diff>
--- a/docs/Project_Report.docx
+++ b/docs/Project_Report.docx
@@ -3936,11 +3936,11 @@
               <a:graphicData uri="http://schemas.openxmlformats.org/drawingml/2006/picture">
                 <pic:pic>
                   <pic:nvPicPr>
-                    <pic:cNvPr id="0" name="gh_project_stage1_planning.png"/>
+                    <pic:cNvPr id="0" name="gh_project_stage3_testing.png"/>
                     <pic:cNvPicPr/>
                   </pic:nvPicPr>
                   <pic:blipFill>
-                    <a:blip r:embed="rId17"/>
+                    <a:blip r:embed="rId18"/>
                     <a:stretch>
                       <a:fillRect/>
                     </a:stretch>
@@ -3991,11 +3991,11 @@
               <a:graphicData uri="http://schemas.openxmlformats.org/drawingml/2006/picture">
                 <pic:pic>
                   <pic:nvPicPr>
-                    <pic:cNvPr id="0" name="gh_project_stage1_planning.png"/>
+                    <pic:cNvPr id="0" name="gh_project_stage4_done.png"/>
                     <pic:cNvPicPr/>
                   </pic:nvPicPr>
                   <pic:blipFill>
-                    <a:blip r:embed="rId17"/>
+                    <a:blip r:embed="rId19"/>
                     <a:stretch>
                       <a:fillRect/>
                     </a:stretch>

</xml_diff>

<commit_message>
docs: add dedicated UML diagrams for Singleton, Factory, and Observer patterns, and update class diagram according to RUET standards
</commit_message>
<xml_diff>
--- a/docs/Project_Report.docx
+++ b/docs/Project_Report.docx
@@ -1577,6 +1577,61 @@
     </w:p>
     <w:p>
       <w:pPr>
+        <w:spacing w:before="120" w:after="40"/>
+        <w:jc w:val="center"/>
+      </w:pPr>
+      <w:r>
+        <w:drawing>
+          <wp:inline xmlns:a="http://schemas.openxmlformats.org/drawingml/2006/main" xmlns:pic="http://schemas.openxmlformats.org/drawingml/2006/picture">
+            <wp:extent cx="4206240" cy="2867891"/>
+            <wp:docPr id="6" name="Picture 6"/>
+            <wp:cNvGraphicFramePr>
+              <a:graphicFrameLocks noChangeAspect="1"/>
+            </wp:cNvGraphicFramePr>
+            <a:graphic>
+              <a:graphicData uri="http://schemas.openxmlformats.org/drawingml/2006/picture">
+                <pic:pic>
+                  <pic:nvPicPr>
+                    <pic:cNvPr id="0" name="pattern_singleton.png"/>
+                    <pic:cNvPicPr/>
+                  </pic:nvPicPr>
+                  <pic:blipFill>
+                    <a:blip r:embed="rId16"/>
+                    <a:stretch>
+                      <a:fillRect/>
+                    </a:stretch>
+                  </pic:blipFill>
+                  <pic:spPr>
+                    <a:xfrm>
+                      <a:off x="0" y="0"/>
+                      <a:ext cx="4206240" cy="2867891"/>
+                    </a:xfrm>
+                    <a:prstGeom prst="rect"/>
+                  </pic:spPr>
+                </pic:pic>
+              </a:graphicData>
+            </a:graphic>
+          </wp:inline>
+        </w:drawing>
+      </w:r>
+    </w:p>
+    <w:p>
+      <w:pPr>
+        <w:spacing w:after="120"/>
+        <w:jc w:val="center"/>
+      </w:pPr>
+      <w:r>
+        <w:rPr>
+          <w:rFonts w:ascii="Times New Roman" w:hAnsi="Times New Roman"/>
+          <w:i/>
+          <w:color w:val="64748B"/>
+          <w:sz w:val="19"/>
+        </w:rPr>
+        <w:t>Figure 6: UML Structure of Singleton Pattern (FirebaseConfigManager)</w:t>
+      </w:r>
+    </w:p>
+    <w:p>
+      <w:pPr>
         <w:spacing w:before="160" w:after="60"/>
       </w:pPr>
       <w:r>
@@ -1650,6 +1705,61 @@
           <w:sz w:val="22"/>
         </w:rPr>
         <w:t xml:space="preserve"> Scattering massive `switch(category)` statements across every component that displays or validates events. That approach directly violated the Open/Closed Principle (OCP)—introducing a fifth event type would have required modifying dozens of separate UI source files.</w:t>
+      </w:r>
+    </w:p>
+    <w:p>
+      <w:pPr>
+        <w:spacing w:before="120" w:after="40"/>
+        <w:jc w:val="center"/>
+      </w:pPr>
+      <w:r>
+        <w:drawing>
+          <wp:inline xmlns:a="http://schemas.openxmlformats.org/drawingml/2006/main" xmlns:pic="http://schemas.openxmlformats.org/drawingml/2006/picture">
+            <wp:extent cx="4389120" cy="3207434"/>
+            <wp:docPr id="7" name="Picture 7"/>
+            <wp:cNvGraphicFramePr>
+              <a:graphicFrameLocks noChangeAspect="1"/>
+            </wp:cNvGraphicFramePr>
+            <a:graphic>
+              <a:graphicData uri="http://schemas.openxmlformats.org/drawingml/2006/picture">
+                <pic:pic>
+                  <pic:nvPicPr>
+                    <pic:cNvPr id="0" name="pattern_factory.png"/>
+                    <pic:cNvPicPr/>
+                  </pic:nvPicPr>
+                  <pic:blipFill>
+                    <a:blip r:embed="rId17"/>
+                    <a:stretch>
+                      <a:fillRect/>
+                    </a:stretch>
+                  </pic:blipFill>
+                  <pic:spPr>
+                    <a:xfrm>
+                      <a:off x="0" y="0"/>
+                      <a:ext cx="4389120" cy="3207434"/>
+                    </a:xfrm>
+                    <a:prstGeom prst="rect"/>
+                  </pic:spPr>
+                </pic:pic>
+              </a:graphicData>
+            </a:graphic>
+          </wp:inline>
+        </w:drawing>
+      </w:r>
+    </w:p>
+    <w:p>
+      <w:pPr>
+        <w:spacing w:after="120"/>
+        <w:jc w:val="center"/>
+      </w:pPr>
+      <w:r>
+        <w:rPr>
+          <w:rFonts w:ascii="Times New Roman" w:hAnsi="Times New Roman"/>
+          <w:i/>
+          <w:color w:val="64748B"/>
+          <w:sz w:val="19"/>
+        </w:rPr>
+        <w:t>Figure 7: UML Structure of Factory Pattern (EventFactory Hierarchy)</w:t>
       </w:r>
     </w:p>
     <w:p>
@@ -1731,41 +1841,14 @@
     </w:p>
     <w:p>
       <w:pPr>
-        <w:spacing w:before="160" w:after="60"/>
-      </w:pPr>
-      <w:r>
-        <w:rPr>
-          <w:rFonts w:ascii="Times New Roman" w:hAnsi="Times New Roman"/>
-          <w:b/>
-          <w:color w:val="1E293B"/>
-          <w:sz w:val="24"/>
-        </w:rPr>
-        <w:t>4.4 UML Class Diagram</w:t>
-      </w:r>
-    </w:p>
-    <w:p>
-      <w:pPr>
-        <w:spacing w:line="276" w:lineRule="auto" w:after="80"/>
-      </w:pPr>
-      <w:r>
-        <w:rPr>
-          <w:rFonts w:ascii="Times New Roman" w:hAnsi="Times New Roman"/>
-          <w:i w:val="0"/>
-          <w:sz w:val="22"/>
-        </w:rPr>
-        <w:t>The comprehensive class diagram in Figure 6 illustrates the relationships, inheritance hierarchies, interfaces, and design pattern integration across the application codebase.</w:t>
-      </w:r>
-    </w:p>
-    <w:p>
-      <w:pPr>
         <w:spacing w:before="120" w:after="40"/>
         <w:jc w:val="center"/>
       </w:pPr>
       <w:r>
         <w:drawing>
           <wp:inline xmlns:a="http://schemas.openxmlformats.org/drawingml/2006/main" xmlns:pic="http://schemas.openxmlformats.org/drawingml/2006/picture">
-            <wp:extent cx="5120640" cy="4023360"/>
-            <wp:docPr id="6" name="Picture 6"/>
+            <wp:extent cx="4389120" cy="3038622"/>
+            <wp:docPr id="8" name="Picture 8"/>
             <wp:cNvGraphicFramePr>
               <a:graphicFrameLocks noChangeAspect="1"/>
             </wp:cNvGraphicFramePr>
@@ -1773,11 +1856,11 @@
               <a:graphicData uri="http://schemas.openxmlformats.org/drawingml/2006/picture">
                 <pic:pic>
                   <pic:nvPicPr>
-                    <pic:cNvPr id="0" name="class_diagram.png"/>
+                    <pic:cNvPr id="0" name="pattern_observer.png"/>
                     <pic:cNvPicPr/>
                   </pic:nvPicPr>
                   <pic:blipFill>
-                    <a:blip r:embed="rId16"/>
+                    <a:blip r:embed="rId18"/>
                     <a:stretch>
                       <a:fillRect/>
                     </a:stretch>
@@ -1785,7 +1868,7 @@
                   <pic:spPr>
                     <a:xfrm>
                       <a:off x="0" y="0"/>
-                      <a:ext cx="5120640" cy="4023360"/>
+                      <a:ext cx="4389120" cy="3038622"/>
                     </a:xfrm>
                     <a:prstGeom prst="rect"/>
                   </pic:spPr>
@@ -1808,7 +1891,89 @@
           <w:color w:val="64748B"/>
           <w:sz w:val="19"/>
         </w:rPr>
-        <w:t>Figure 6: Complete UML Class Diagram Illustrating Singleton, Factory, and Observer Design Patterns</w:t>
+        <w:t>Figure 8: UML Structure of Observer Pattern (EventBus &amp; UI Observers)</w:t>
+      </w:r>
+    </w:p>
+    <w:p>
+      <w:pPr>
+        <w:spacing w:before="160" w:after="60"/>
+      </w:pPr>
+      <w:r>
+        <w:rPr>
+          <w:rFonts w:ascii="Times New Roman" w:hAnsi="Times New Roman"/>
+          <w:b/>
+          <w:color w:val="1E293B"/>
+          <w:sz w:val="24"/>
+        </w:rPr>
+        <w:t>4.4 Comprehensive System UML Class Diagram</w:t>
+      </w:r>
+    </w:p>
+    <w:p>
+      <w:pPr>
+        <w:spacing w:line="276" w:lineRule="auto" w:after="80"/>
+      </w:pPr>
+      <w:r>
+        <w:rPr>
+          <w:rFonts w:ascii="Times New Roman" w:hAnsi="Times New Roman"/>
+          <w:i w:val="0"/>
+          <w:sz w:val="22"/>
+        </w:rPr>
+        <w:t>Figure 9 illustrates the complete object-oriented structure of CampusSync, adhering to the standard RUET CSE Department modeling conventions. Each class is structured into three standard compartments (Name, Attributes with visibility and type, and Methods with parameter types and return values). The diagram explicitly illustrates Generalization (inheritance between CampusEvent and its subclasses), Composition (CampusEvent strongly owns its RSVPReservations), Aggregation (UserProfile owns RSVPReservations), and Dependency (services calling EventFactory and EventBus).</w:t>
+      </w:r>
+    </w:p>
+    <w:p>
+      <w:pPr>
+        <w:spacing w:before="120" w:after="40"/>
+        <w:jc w:val="center"/>
+      </w:pPr>
+      <w:r>
+        <w:drawing>
+          <wp:inline xmlns:a="http://schemas.openxmlformats.org/drawingml/2006/main" xmlns:pic="http://schemas.openxmlformats.org/drawingml/2006/picture">
+            <wp:extent cx="5029200" cy="4023360"/>
+            <wp:docPr id="9" name="Picture 9"/>
+            <wp:cNvGraphicFramePr>
+              <a:graphicFrameLocks noChangeAspect="1"/>
+            </wp:cNvGraphicFramePr>
+            <a:graphic>
+              <a:graphicData uri="http://schemas.openxmlformats.org/drawingml/2006/picture">
+                <pic:pic>
+                  <pic:nvPicPr>
+                    <pic:cNvPr id="0" name="class_diagram.png"/>
+                    <pic:cNvPicPr/>
+                  </pic:nvPicPr>
+                  <pic:blipFill>
+                    <a:blip r:embed="rId19"/>
+                    <a:stretch>
+                      <a:fillRect/>
+                    </a:stretch>
+                  </pic:blipFill>
+                  <pic:spPr>
+                    <a:xfrm>
+                      <a:off x="0" y="0"/>
+                      <a:ext cx="5029200" cy="4023360"/>
+                    </a:xfrm>
+                    <a:prstGeom prst="rect"/>
+                  </pic:spPr>
+                </pic:pic>
+              </a:graphicData>
+            </a:graphic>
+          </wp:inline>
+        </w:drawing>
+      </w:r>
+    </w:p>
+    <w:p>
+      <w:pPr>
+        <w:spacing w:after="120"/>
+        <w:jc w:val="center"/>
+      </w:pPr>
+      <w:r>
+        <w:rPr>
+          <w:rFonts w:ascii="Times New Roman" w:hAnsi="Times New Roman"/>
+          <w:i/>
+          <w:color w:val="64748B"/>
+          <w:sz w:val="19"/>
+        </w:rPr>
+        <w:t>Figure 9: Comprehensive CampusSync UML Class Diagram (With RUET Standard Multiplicities, Compositions, and Aggregations)</w:t>
       </w:r>
     </w:p>
     <w:p>
@@ -3806,7 +3971,7 @@
           <w:i w:val="0"/>
           <w:sz w:val="22"/>
         </w:rPr>
-        <w:t>Figures 7 through 10 demonstrate the lifecycle progression of CampusSync across four distinct operational sprint stages:</w:t>
+        <w:t>Figures 10 through 13 demonstrate the lifecycle progression of CampusSync across four distinct operational sprint stages:</w:t>
       </w:r>
     </w:p>
     <w:p>
@@ -3818,7 +3983,7 @@
         <w:drawing>
           <wp:inline xmlns:a="http://schemas.openxmlformats.org/drawingml/2006/main" xmlns:pic="http://schemas.openxmlformats.org/drawingml/2006/picture">
             <wp:extent cx="4937760" cy="3086100"/>
-            <wp:docPr id="7" name="Picture 7"/>
+            <wp:docPr id="10" name="Picture 10"/>
             <wp:cNvGraphicFramePr>
               <a:graphicFrameLocks noChangeAspect="1"/>
             </wp:cNvGraphicFramePr>
@@ -3830,7 +3995,7 @@
                     <pic:cNvPicPr/>
                   </pic:nvPicPr>
                   <pic:blipFill>
-                    <a:blip r:embed="rId17"/>
+                    <a:blip r:embed="rId20"/>
                     <a:stretch>
                       <a:fillRect/>
                     </a:stretch>
@@ -3861,7 +4026,7 @@
           <w:color w:val="64748B"/>
           <w:sz w:val="19"/>
         </w:rPr>
-        <w:t>Figure 7: Stage 1 — Sprint Backlog Grooming &amp; Task Prioritization (All Tasks in Backlog / Todo)</w:t>
+        <w:t>Figure 10: Stage 1 — Sprint Backlog Grooming &amp; Task Prioritization (All Tasks in Backlog / Todo)</w:t>
       </w:r>
     </w:p>
     <w:p>
@@ -3873,7 +4038,7 @@
         <w:drawing>
           <wp:inline xmlns:a="http://schemas.openxmlformats.org/drawingml/2006/main" xmlns:pic="http://schemas.openxmlformats.org/drawingml/2006/picture">
             <wp:extent cx="4937760" cy="3086100"/>
-            <wp:docPr id="8" name="Picture 8"/>
+            <wp:docPr id="11" name="Picture 11"/>
             <wp:cNvGraphicFramePr>
               <a:graphicFrameLocks noChangeAspect="1"/>
             </wp:cNvGraphicFramePr>
@@ -3885,7 +4050,7 @@
                     <pic:cNvPicPr/>
                   </pic:nvPicPr>
                   <pic:blipFill>
-                    <a:blip r:embed="rId17"/>
+                    <a:blip r:embed="rId20"/>
                     <a:stretch>
                       <a:fillRect/>
                     </a:stretch>
@@ -3916,7 +4081,7 @@
           <w:color w:val="64748B"/>
           <w:sz w:val="19"/>
         </w:rPr>
-        <w:t>Figure 8: Stage 2 — Active Feature Development &amp; In-Progress Module Implementation</w:t>
+        <w:t>Figure 11: Stage 2 — Active Feature Development &amp; In-Progress Module Implementation</w:t>
       </w:r>
     </w:p>
     <w:p>
@@ -3928,7 +4093,7 @@
         <w:drawing>
           <wp:inline xmlns:a="http://schemas.openxmlformats.org/drawingml/2006/main" xmlns:pic="http://schemas.openxmlformats.org/drawingml/2006/picture">
             <wp:extent cx="4937760" cy="3086100"/>
-            <wp:docPr id="9" name="Picture 9"/>
+            <wp:docPr id="12" name="Picture 12"/>
             <wp:cNvGraphicFramePr>
               <a:graphicFrameLocks noChangeAspect="1"/>
             </wp:cNvGraphicFramePr>
@@ -3940,7 +4105,7 @@
                     <pic:cNvPicPr/>
                   </pic:nvPicPr>
                   <pic:blipFill>
-                    <a:blip r:embed="rId18"/>
+                    <a:blip r:embed="rId21"/>
                     <a:stretch>
                       <a:fillRect/>
                     </a:stretch>
@@ -3971,7 +4136,7 @@
           <w:color w:val="64748B"/>
           <w:sz w:val="19"/>
         </w:rPr>
-        <w:t>Figure 9: Stage 3 — Testing, Mock Isolation &amp; PR Code Review Phase</w:t>
+        <w:t>Figure 12: Stage 3 — Testing, Mock Isolation &amp; PR Code Review Phase</w:t>
       </w:r>
     </w:p>
     <w:p>
@@ -3983,7 +4148,7 @@
         <w:drawing>
           <wp:inline xmlns:a="http://schemas.openxmlformats.org/drawingml/2006/main" xmlns:pic="http://schemas.openxmlformats.org/drawingml/2006/picture">
             <wp:extent cx="4937760" cy="3086100"/>
-            <wp:docPr id="10" name="Picture 10"/>
+            <wp:docPr id="13" name="Picture 13"/>
             <wp:cNvGraphicFramePr>
               <a:graphicFrameLocks noChangeAspect="1"/>
             </wp:cNvGraphicFramePr>
@@ -3995,7 +4160,7 @@
                     <pic:cNvPicPr/>
                   </pic:nvPicPr>
                   <pic:blipFill>
-                    <a:blip r:embed="rId19"/>
+                    <a:blip r:embed="rId22"/>
                     <a:stretch>
                       <a:fillRect/>
                     </a:stretch>
@@ -4026,7 +4191,7 @@
           <w:color w:val="64748B"/>
           <w:sz w:val="19"/>
         </w:rPr>
-        <w:t>Figure 10: Stage 4 — Sprint Completion, Artifact Generation &amp; Release (100% Velocity Completed)</w:t>
+        <w:t>Figure 13: Stage 4 — Sprint Completion, Artifact Generation &amp; Release (100% Velocity Completed)</w:t>
       </w:r>
     </w:p>
     <w:p>

</xml_diff>